<commit_message>
docs(interview-prep): JustGames — restructure questions around four areas
Replace the original "qualifying / funding / role-shape / strategic" question
buckets with a goal-driven four-area structure:

  A. PRODUCT — what am I selling, to whom? (B2B / B2C / both)
  B. LICENSING — can the customer legally touch it?
  C. AMBASSADORS — who and for what?
  D. THE $1M BUDGET — what does Igor see it spent on?

The four areas force concrete answers about what JustGames actually is.
Close-out questions (entity, funding, process, comp signal) demoted to a
90-second tail after the four areas.

All four formats updated: PREP.md, PREP.html (with new area-block styling
and lettered headers), PREP.docx, CHEAT_SHEET.md, CHEAT_SHEET.html, CHEAT_SHEET.docx.

Co-Authored-By: Claude Opus 4.7 <noreply@anthropic.com>
</commit_message>
<xml_diff>
--- a/JobSearch/interview-prep/justgames/CHEAT_SHEET.docx
+++ b/JobSearch/interview-prep/justgames/CHEAT_SHEET.docx
@@ -418,7 +418,40 @@
           <w:sz w:val="30"/>
           <w:szCs w:val="30"/>
         </w:rPr>
-        <w:t xml:space="preserve">SHARPEST QUESTIONS (ask 5-7, in order)</w:t>
+        <w:t xml:space="preserve">QUESTIONS — Four areas, in this order</w:t>
+      </w:r>
+    </w:p>
+    <w:p>
+      <w:pPr>
+        <w:spacing w:after="120" w:before="80" w:line="300"/>
+      </w:pPr>
+      <w:r>
+        <w:rPr>
+          <w:rFonts w:ascii="Calibri" w:cs="Calibri" w:eastAsia="Calibri" w:hAnsi="Calibri"/>
+          <w:b/>
+          <w:bCs/>
+          <w:color w:val="1A1A1A"/>
+          <w:sz w:val="22"/>
+          <w:szCs w:val="22"/>
+        </w:rPr>
+        <w:t xml:space="preserve">Goal: find out what JustGames actually IS. If Nathan can answer A and B with specifics, this is real.</w:t>
+      </w:r>
+    </w:p>
+    <w:p>
+      <w:pPr>
+        <w:pStyle w:val="Heading3"/>
+        <w:spacing w:after="150" w:before="300"/>
+      </w:pPr>
+      <w:r>
+        <w:rPr>
+          <w:rFonts w:ascii="Calibri" w:cs="Calibri" w:eastAsia="Calibri" w:hAnsi="Calibri"/>
+          <w:b/>
+          <w:bCs/>
+          <w:color w:val="2E75B6"/>
+          <w:sz w:val="26"/>
+          <w:szCs w:val="26"/>
+        </w:rPr>
+        <w:t xml:space="preserve">A. PRODUCT — what am I selling, to whom?</w:t>
       </w:r>
     </w:p>
     <w:p>
@@ -439,7 +472,7 @@
           <w:sz w:val="22"/>
           <w:szCs w:val="22"/>
         </w:rPr>
-        <w:t xml:space="preserve">"How did Igor's team come to engage Talent SDK? Your background is gaming/AI/defense — curious how this role landed with you."</w:t>
+        <w:t xml:space="preserve">"Walk me through the product — is JustGames a B2C sportsbook on its own protocol, a B2B infrastructure layer operators plug into, or both — protocol + flagship frontend?"</w:t>
       </w:r>
     </w:p>
     <w:p>
@@ -460,7 +493,7 @@
           <w:sz w:val="22"/>
           <w:szCs w:val="22"/>
         </w:rPr>
-        <w:t xml:space="preserve">"What's the legal entity name and jurisdiction of incorporation?"</w:t>
+        <w:t xml:space="preserve">"Who's the customer the CMO acquires — end-users, operators, or developer teams building frontends?"</w:t>
       </w:r>
     </w:p>
     <w:p>
@@ -481,7 +514,24 @@
           <w:sz w:val="22"/>
           <w:szCs w:val="22"/>
         </w:rPr>
-        <w:t xml:space="preserve">"Of the four founders, who's run a regulated betting operation before? How is product/engineering staffed below Peter?"</w:t>
+        <w:t xml:space="preserve">"Is there a thought about JustGames running its own branded B2C sportsbook on top of the protocol, or is the strategy strictly to enable other operators?"</w:t>
+      </w:r>
+    </w:p>
+    <w:p>
+      <w:pPr>
+        <w:pStyle w:val="Heading3"/>
+        <w:spacing w:after="150" w:before="300"/>
+      </w:pPr>
+      <w:r>
+        <w:rPr>
+          <w:rFonts w:ascii="Calibri" w:cs="Calibri" w:eastAsia="Calibri" w:hAnsi="Calibri"/>
+          <w:b/>
+          <w:bCs/>
+          <w:color w:val="2E75B6"/>
+          <w:sz w:val="26"/>
+          <w:szCs w:val="26"/>
+        </w:rPr>
+        <w:t xml:space="preserve">B. LICENSING — can the customer legally touch it?</w:t>
       </w:r>
     </w:p>
     <w:p>
@@ -502,7 +552,7 @@
           <w:sz w:val="22"/>
           <w:szCs w:val="22"/>
         </w:rPr>
-        <w:t xml:space="preserve">"How is the $3.5M structured — pre-seed, seed, SAFE? Who's the lead investor? What's the Series A target?"</w:t>
+        <w:t xml:space="preserve">"Geographic strategy — which countries on day one, which geo-blocked? Licensed regulated markets, gray markets, or both with different stacks?"</w:t>
       </w:r>
     </w:p>
     <w:p>
@@ -523,7 +573,7 @@
           <w:sz w:val="22"/>
           <w:szCs w:val="22"/>
         </w:rPr>
-        <w:t xml:space="preserve">"Why hire a CMO 4-6 weeks before launch rather than 4-6 months ago? Who's been doing marketing until now?"</w:t>
+        <w:t xml:space="preserve">"B2B side — selling to licensed operators (MGA, UKGC, ADM, Brazilian Bets, Ontario) or gray-market crypto operators? Sales motion and certifications are different worlds."</w:t>
       </w:r>
     </w:p>
     <w:p>
@@ -544,7 +594,7 @@
           <w:sz w:val="22"/>
           <w:szCs w:val="22"/>
         </w:rPr>
-        <w:t xml:space="preserve">"What does Igor expect the CMO to own on day one — brand + growth only, or also CRM, retention, ops, analytics?"</w:t>
+        <w:t xml:space="preserve">"Can the product be licensed at all? Is the protocol itself something you'd put through MGA Class 2 / Brazilian Bets, or deliberately outside licensing — let frontends carry licenses?"</w:t>
       </w:r>
     </w:p>
     <w:p>
@@ -565,7 +615,24 @@
           <w:sz w:val="22"/>
           <w:szCs w:val="22"/>
         </w:rPr>
-        <w:t xml:space="preserve">"Comp structure — base, equity, cash bonus, token allocation if there's a token? OTE range?"</w:t>
+        <w:t xml:space="preserve">"What does legal say about Brazil specifically — going through Bets licensing or geo-blocking Brazil at launch?"</w:t>
+      </w:r>
+    </w:p>
+    <w:p>
+      <w:pPr>
+        <w:pStyle w:val="Heading3"/>
+        <w:spacing w:after="150" w:before="300"/>
+      </w:pPr>
+      <w:r>
+        <w:rPr>
+          <w:rFonts w:ascii="Calibri" w:cs="Calibri" w:eastAsia="Calibri" w:hAnsi="Calibri"/>
+          <w:b/>
+          <w:bCs/>
+          <w:color w:val="2E75B6"/>
+          <w:sz w:val="26"/>
+          <w:szCs w:val="26"/>
+        </w:rPr>
+        <w:t xml:space="preserve">C. AMBASSADORS — who and for what?</w:t>
       </w:r>
     </w:p>
     <w:p>
@@ -586,7 +653,7 @@
           <w:sz w:val="22"/>
           <w:szCs w:val="22"/>
         </w:rPr>
-        <w:t xml:space="preserve">(If room) "What's the licensing strategy for EU, AU, Brazil — protocol with third-party frontends or own licensed frontend?"</w:t>
+        <w:t xml:space="preserve">"Who are the ambassadors — poker world, crypto/Web3, sports, or a mix?"</w:t>
       </w:r>
     </w:p>
     <w:p>
@@ -607,7 +674,251 @@
           <w:sz w:val="22"/>
           <w:szCs w:val="22"/>
         </w:rPr>
-        <w:t xml:space="preserve">(Close) "What's the process from here, timeline, who I'd meet at each stage?"</w:t>
+        <w:t xml:space="preserve">"What's the ambassador's actual role on launch — drive B2C signups, lend credibility to operator sales, or distribute through their content audience? The work with Phil Hellmuth to drive B2C is completely different from using him at a B2B conference."</w:t>
+      </w:r>
+    </w:p>
+    <w:p>
+      <w:pPr>
+        <w:pStyle w:val="ListParagraph"/>
+        <w:numPr>
+          <w:ilvl w:val="0"/>
+          <w:numId w:val="2"/>
+        </w:numPr>
+        <w:spacing w:after="40" w:before="40" w:line="280"/>
+      </w:pPr>
+      <w:r>
+        <w:rPr>
+          <w:rFonts w:ascii="Calibri" w:cs="Calibri" w:eastAsia="Calibri" w:hAnsi="Calibri"/>
+          <w:i/>
+          <w:iCs/>
+          <w:color w:val="1A1A1A"/>
+          <w:sz w:val="22"/>
+          <w:szCs w:val="22"/>
+        </w:rPr>
+        <w:t xml:space="preserve">"If this is B2B, what would an ambassador actually do? Operators don't buy infrastructure from poker pros — they buy from a sales team with certifications and references."</w:t>
+      </w:r>
+    </w:p>
+    <w:p>
+      <w:pPr>
+        <w:pStyle w:val="ListParagraph"/>
+        <w:numPr>
+          <w:ilvl w:val="0"/>
+          <w:numId w:val="2"/>
+        </w:numPr>
+        <w:spacing w:after="40" w:before="40" w:line="280"/>
+      </w:pPr>
+      <w:r>
+        <w:rPr>
+          <w:rFonts w:ascii="Calibri" w:cs="Calibri" w:eastAsia="Calibri" w:hAnsi="Calibri"/>
+          <w:i/>
+          <w:iCs/>
+          <w:color w:val="1A1A1A"/>
+          <w:sz w:val="22"/>
+          <w:szCs w:val="22"/>
+        </w:rPr>
+        <w:t xml:space="preserve">"Ambassadors equity holders, paid spokespeople, or token allocation? Deal structure shapes how aggressively I can ask them to work."</w:t>
+      </w:r>
+    </w:p>
+    <w:p>
+      <w:pPr>
+        <w:pStyle w:val="Heading3"/>
+        <w:spacing w:after="150" w:before="300"/>
+      </w:pPr>
+      <w:r>
+        <w:rPr>
+          <w:rFonts w:ascii="Calibri" w:cs="Calibri" w:eastAsia="Calibri" w:hAnsi="Calibri"/>
+          <w:b/>
+          <w:bCs/>
+          <w:color w:val="2E75B6"/>
+          <w:sz w:val="26"/>
+          <w:szCs w:val="26"/>
+        </w:rPr>
+        <w:t xml:space="preserve">D. THE $1M BUDGET — what does Igor see it spent on?</w:t>
+      </w:r>
+    </w:p>
+    <w:p>
+      <w:pPr>
+        <w:pStyle w:val="ListParagraph"/>
+        <w:numPr>
+          <w:ilvl w:val="0"/>
+          <w:numId w:val="2"/>
+        </w:numPr>
+        <w:spacing w:after="40" w:before="40" w:line="280"/>
+      </w:pPr>
+      <w:r>
+        <w:rPr>
+          <w:rFonts w:ascii="Calibri" w:cs="Calibri" w:eastAsia="Calibri" w:hAnsi="Calibri"/>
+          <w:i/>
+          <w:iCs/>
+          <w:color w:val="1A1A1A"/>
+          <w:sz w:val="22"/>
+          <w:szCs w:val="22"/>
+        </w:rPr>
+        <w:t xml:space="preserve">"What does Igor see the $1M spent on — conferences and industry sales, influencer deals, crypto KOLs and points, paid acquisition, cold outbound to operators?"</w:t>
+      </w:r>
+    </w:p>
+    <w:p>
+      <w:pPr>
+        <w:pStyle w:val="ListParagraph"/>
+        <w:numPr>
+          <w:ilvl w:val="0"/>
+          <w:numId w:val="2"/>
+        </w:numPr>
+        <w:spacing w:after="40" w:before="40" w:line="280"/>
+      </w:pPr>
+      <w:r>
+        <w:rPr>
+          <w:rFonts w:ascii="Calibri" w:cs="Calibri" w:eastAsia="Calibri" w:hAnsi="Calibri"/>
+          <w:i/>
+          <w:iCs/>
+          <w:color w:val="1A1A1A"/>
+          <w:sz w:val="22"/>
+          <w:szCs w:val="22"/>
+        </w:rPr>
+        <w:t xml:space="preserve">"What's the rough split between B2B sales motion (conferences, trade press, cold outbound) versus B2C acquisition (paid, affiliates, ambassador-driven trial)? $1M is plenty for one, tight for both."</w:t>
+      </w:r>
+    </w:p>
+    <w:p>
+      <w:pPr>
+        <w:pStyle w:val="ListParagraph"/>
+        <w:numPr>
+          <w:ilvl w:val="0"/>
+          <w:numId w:val="2"/>
+        </w:numPr>
+        <w:spacing w:after="40" w:before="40" w:line="280"/>
+      </w:pPr>
+      <w:r>
+        <w:rPr>
+          <w:rFonts w:ascii="Calibri" w:cs="Calibri" w:eastAsia="Calibri" w:hAnsi="Calibri"/>
+          <w:i/>
+          <w:iCs/>
+          <w:color w:val="1A1A1A"/>
+          <w:sz w:val="22"/>
+          <w:szCs w:val="22"/>
+        </w:rPr>
+        <w:t xml:space="preserve">"Is $1M for pre-launch awareness only, or first 6 months of operating spend?"</w:t>
+      </w:r>
+    </w:p>
+    <w:p>
+      <w:pPr>
+        <w:pStyle w:val="ListParagraph"/>
+        <w:numPr>
+          <w:ilvl w:val="0"/>
+          <w:numId w:val="2"/>
+        </w:numPr>
+        <w:spacing w:after="40" w:before="40" w:line="280"/>
+      </w:pPr>
+      <w:r>
+        <w:rPr>
+          <w:rFonts w:ascii="Calibri" w:cs="Calibri" w:eastAsia="Calibri" w:hAnsi="Calibri"/>
+          <w:i/>
+          <w:iCs/>
+          <w:color w:val="1A1A1A"/>
+          <w:sz w:val="22"/>
+          <w:szCs w:val="22"/>
+        </w:rPr>
+        <w:t xml:space="preserve">"What channels are off the table given the regulatory posture? Google/Meta closed for unlicensed; sports sponsorships need an operator license."</w:t>
+      </w:r>
+    </w:p>
+    <w:p>
+      <w:pPr>
+        <w:pStyle w:val="Heading3"/>
+        <w:spacing w:after="150" w:before="300"/>
+      </w:pPr>
+      <w:r>
+        <w:rPr>
+          <w:rFonts w:ascii="Calibri" w:cs="Calibri" w:eastAsia="Calibri" w:hAnsi="Calibri"/>
+          <w:b/>
+          <w:bCs/>
+          <w:color w:val="2E75B6"/>
+          <w:sz w:val="26"/>
+          <w:szCs w:val="26"/>
+        </w:rPr>
+        <w:t xml:space="preserve">Close-out (90 sec max)</w:t>
+      </w:r>
+    </w:p>
+    <w:p>
+      <w:pPr>
+        <w:pStyle w:val="ListParagraph"/>
+        <w:numPr>
+          <w:ilvl w:val="0"/>
+          <w:numId w:val="2"/>
+        </w:numPr>
+        <w:spacing w:after="40" w:before="40" w:line="280"/>
+      </w:pPr>
+      <w:r>
+        <w:rPr>
+          <w:rFonts w:ascii="Calibri" w:cs="Calibri" w:eastAsia="Calibri" w:hAnsi="Calibri"/>
+          <w:i/>
+          <w:iCs/>
+          <w:color w:val="1A1A1A"/>
+          <w:sz w:val="22"/>
+          <w:szCs w:val="22"/>
+        </w:rPr>
+        <w:t xml:space="preserve">"Legal entity name and jurisdiction of incorporation?"</w:t>
+      </w:r>
+    </w:p>
+    <w:p>
+      <w:pPr>
+        <w:pStyle w:val="ListParagraph"/>
+        <w:numPr>
+          <w:ilvl w:val="0"/>
+          <w:numId w:val="2"/>
+        </w:numPr>
+        <w:spacing w:after="40" w:before="40" w:line="280"/>
+      </w:pPr>
+      <w:r>
+        <w:rPr>
+          <w:rFonts w:ascii="Calibri" w:cs="Calibri" w:eastAsia="Calibri" w:hAnsi="Calibri"/>
+          <w:i/>
+          <w:iCs/>
+          <w:color w:val="1A1A1A"/>
+          <w:sz w:val="22"/>
+          <w:szCs w:val="22"/>
+        </w:rPr>
+        <w:t xml:space="preserve">"$3.5M structure, lead investor, Series A milestone?"</w:t>
+      </w:r>
+    </w:p>
+    <w:p>
+      <w:pPr>
+        <w:pStyle w:val="ListParagraph"/>
+        <w:numPr>
+          <w:ilvl w:val="0"/>
+          <w:numId w:val="2"/>
+        </w:numPr>
+        <w:spacing w:after="40" w:before="40" w:line="280"/>
+      </w:pPr>
+      <w:r>
+        <w:rPr>
+          <w:rFonts w:ascii="Calibri" w:cs="Calibri" w:eastAsia="Calibri" w:hAnsi="Calibri"/>
+          <w:i/>
+          <w:iCs/>
+          <w:color w:val="1A1A1A"/>
+          <w:sz w:val="22"/>
+          <w:szCs w:val="22"/>
+        </w:rPr>
+        <w:t xml:space="preserve">"Process from here, timeline, who I'd meet?"</w:t>
+      </w:r>
+    </w:p>
+    <w:p>
+      <w:pPr>
+        <w:pStyle w:val="ListParagraph"/>
+        <w:numPr>
+          <w:ilvl w:val="0"/>
+          <w:numId w:val="2"/>
+        </w:numPr>
+        <w:spacing w:after="40" w:before="40" w:line="280"/>
+      </w:pPr>
+      <w:r>
+        <w:rPr>
+          <w:rFonts w:ascii="Calibri" w:cs="Calibri" w:eastAsia="Calibri" w:hAnsi="Calibri"/>
+          <w:i/>
+          <w:iCs/>
+          <w:color w:val="1A1A1A"/>
+          <w:sz w:val="22"/>
+          <w:szCs w:val="22"/>
+        </w:rPr>
+        <w:t xml:space="preserve">"What would make a candidate stand out to Igor specifically?"</w:t>
       </w:r>
     </w:p>
     <w:p>

</xml_diff>